<commit_message>
Integrated 3D modelling UI
</commit_message>
<xml_diff>
--- a/docs/TerraVoxel.docx
+++ b/docs/TerraVoxel.docx
@@ -1904,31 +1904,7 @@
     </w:p>
     <w:p>
       <w:r>
-        <w:t xml:space="preserve">│  │  </w:t>
-      </w:r>
-      <w:proofErr w:type="spellStart"/>
-      <w:r>
-        <w:t>Mapbox</w:t>
-      </w:r>
-      <w:proofErr w:type="spellEnd"/>
-      <w:r>
-        <w:t xml:space="preserve"> /    │  │  </w:t>
-      </w:r>
-      <w:proofErr w:type="spellStart"/>
-      <w:r>
-        <w:t>SoilGrids</w:t>
-      </w:r>
-      <w:proofErr w:type="spellEnd"/>
-      <w:r>
-        <w:t xml:space="preserve">   │  │  </w:t>
-      </w:r>
-      <w:proofErr w:type="spellStart"/>
-      <w:r>
-        <w:t>OpenWeather</w:t>
-      </w:r>
-      <w:proofErr w:type="spellEnd"/>
-      <w:r>
-        <w:t xml:space="preserve"> │  │  Carbon Price│  │</w:t>
+        <w:t>│  │  Leaflet/MapLibre /    │  │  SoilGrids   │  │  OpenWeather │  │  Carbon Price│  │</w:t>
       </w:r>
     </w:p>
     <w:p>
@@ -2686,24 +2662,8 @@
           <w:numId w:val="9"/>
         </w:numPr>
       </w:pPr>
-      <w:proofErr w:type="spellStart"/>
-      <w:r>
-        <w:rPr>
-          <w:i/>
-          <w:iCs/>
-        </w:rPr>
-        <w:t>Mapbox</w:t>
-      </w:r>
-      <w:proofErr w:type="spellEnd"/>
-      <w:r>
-        <w:rPr>
-          <w:i/>
-          <w:iCs/>
-        </w:rPr>
-        <w:t xml:space="preserve"> GL JS</w:t>
-      </w:r>
-      <w:r>
-        <w:t xml:space="preserve"> for overlaying species zoning polygons on the original satellite image.</w:t>
+      <w:r>
+        <w:t>Leaflet / MapLibre GL JS for overlaying species zoning polygons on the original satellite image.</w:t>
       </w:r>
     </w:p>
     <w:p>
@@ -2819,27 +2779,7 @@
         </w:rPr>
       </w:pPr>
       <w:r>
-        <w:rPr>
-          <w:b/>
-          <w:bCs/>
-        </w:rPr>
-        <w:t xml:space="preserve">4.1 Geospatial Input Module (Map Polygon/Pin Drop via </w:t>
-      </w:r>
-      <w:proofErr w:type="spellStart"/>
-      <w:r>
-        <w:rPr>
-          <w:b/>
-          <w:bCs/>
-        </w:rPr>
-        <w:t>Mapbox</w:t>
-      </w:r>
-      <w:proofErr w:type="spellEnd"/>
-      <w:r>
-        <w:rPr>
-          <w:b/>
-          <w:bCs/>
-        </w:rPr>
-        <w:t>/Google Maps)</w:t>
+        <w:t>4.1 Geospatial Input Module (Map Polygon/Pin Drop via Leaflet/MapLibre)</w:t>
       </w:r>
     </w:p>
     <w:p>
@@ -2966,29 +2906,8 @@
             <w:hideMark/>
           </w:tcPr>
           <w:p>
-            <w:proofErr w:type="spellStart"/>
-            <w:r>
-              <w:t>Mapbox</w:t>
-            </w:r>
-            <w:proofErr w:type="spellEnd"/>
-            <w:r>
-              <w:t xml:space="preserve"> GL JS (v3.0) with satellite imagery </w:t>
-            </w:r>
-            <w:proofErr w:type="spellStart"/>
-            <w:r>
-              <w:t>tileset</w:t>
-            </w:r>
-            <w:proofErr w:type="spellEnd"/>
-            <w:r>
-              <w:t xml:space="preserve">. Fallback to Google Maps JavaScript API if </w:t>
-            </w:r>
-            <w:proofErr w:type="spellStart"/>
-            <w:r>
-              <w:t>Mapbox</w:t>
-            </w:r>
-            <w:proofErr w:type="spellEnd"/>
-            <w:r>
-              <w:t xml:space="preserve"> license unavailable.</w:t>
+            <w:r>
+              <w:t>MapLibre GL JS with satellite imagery tileset. Fallback to Google Maps JavaScript API if Leaflet/MapLibre license unavailable.</w:t>
             </w:r>
           </w:p>
         </w:tc>
@@ -3048,17 +2967,8 @@
             <w:hideMark/>
           </w:tcPr>
           <w:p>
-            <w:proofErr w:type="spellStart"/>
-            <w:r>
-              <w:t>Mapbox</w:t>
-            </w:r>
-            <w:proofErr w:type="spellEnd"/>
-            <w:r>
-              <w:t xml:space="preserve"> Draw plugin with custom controls. Supports freehand drawing, </w:t>
-            </w:r>
-            <w:r>
-              <w:lastRenderedPageBreak/>
-              <w:t>rectangular/square snap, and vertex editing.</w:t>
+            <w:r>
+              <w:t>Leaflet-Draw plugin with custom controls. Supports freehand drawing, rectangular/square snap, and vertex editing.</w:t>
             </w:r>
           </w:p>
         </w:tc>
@@ -3219,31 +3129,7 @@
           </w:tcPr>
           <w:p>
             <w:r>
-              <w:t xml:space="preserve">Latitude/longitude of polygon centroid (or pin </w:t>
-            </w:r>
-            <w:proofErr w:type="spellStart"/>
-            <w:r>
-              <w:t>center</w:t>
-            </w:r>
-            <w:proofErr w:type="spellEnd"/>
-            <w:r>
-              <w:t xml:space="preserve">) extracted via </w:t>
-            </w:r>
-            <w:proofErr w:type="spellStart"/>
-            <w:r>
-              <w:t>Mapbox's</w:t>
-            </w:r>
-            <w:proofErr w:type="spellEnd"/>
-            <w:r>
-              <w:t xml:space="preserve"> </w:t>
-            </w:r>
-            <w:proofErr w:type="spellStart"/>
-            <w:r>
-              <w:t>queryRenderedFeatures</w:t>
-            </w:r>
-            <w:proofErr w:type="spellEnd"/>
-            <w:r>
-              <w:t xml:space="preserve"> or Turf.js centroid.</w:t>
+              <w:t>Latitude/longitude of polygon centroid (or pin center) extracted via Leaflet/MapLibre's queryRenderedFeatures or Turf.js centroid.</w:t>
             </w:r>
           </w:p>
         </w:tc>
@@ -3350,15 +3236,7 @@
           </w:tcPr>
           <w:p>
             <w:r>
-              <w:t xml:space="preserve">Via </w:t>
-            </w:r>
-            <w:proofErr w:type="spellStart"/>
-            <w:r>
-              <w:t>Mapbox's</w:t>
-            </w:r>
-            <w:proofErr w:type="spellEnd"/>
-            <w:r>
-              <w:t xml:space="preserve"> vintage imagery API, user can toggle between current and 5-year-old satellite imagery to visually assess historical land degradation.</w:t>
+              <w:t>Via Leaflet/MapLibre's vintage imagery API, user can toggle between current and 5-year-old satellite imagery to visually assess historical land degradation.</w:t>
             </w:r>
           </w:p>
         </w:tc>
@@ -4918,21 +4796,8 @@
             <w:hideMark/>
           </w:tcPr>
           <w:p>
-            <w:proofErr w:type="spellStart"/>
-            <w:r>
-              <w:rPr>
-                <w:b/>
-                <w:bCs/>
-              </w:rPr>
-              <w:t>Mapbox</w:t>
-            </w:r>
-            <w:proofErr w:type="spellEnd"/>
-            <w:r>
-              <w:rPr>
-                <w:b/>
-                <w:bCs/>
-              </w:rPr>
-              <w:t xml:space="preserve"> Geocoding</w:t>
+            <w:r>
+              <w:t>OpenStreetMap Geocoding</w:t>
             </w:r>
           </w:p>
         </w:tc>
@@ -4960,8 +4825,7 @@
           </w:tcPr>
           <w:p>
             <w:r>
-              <w:lastRenderedPageBreak/>
-              <w:t>GET https://api.mapbox.com/geocoding/v5/mapbox.places/{lon},{lat}.json</w:t>
+              <w:t>GET https://nominatim.openstreetmap.org/search/{lon},{lat}.json</w:t>
             </w:r>
           </w:p>
         </w:tc>
@@ -10157,15 +10021,7 @@
           </w:tcPr>
           <w:p>
             <w:r>
-              <w:t xml:space="preserve">User draws polygon on </w:t>
-            </w:r>
-            <w:proofErr w:type="spellStart"/>
-            <w:r>
-              <w:t>Mapbox</w:t>
-            </w:r>
-            <w:proofErr w:type="spellEnd"/>
-            <w:r>
-              <w:t>/Google Maps; area is auto-calculated using Turf.js geodesic computation. User can manually override the area value if needed.</w:t>
+              <w:t>User draws polygon on Leaflet/MapLibre; area is auto-calculated using Turf.js geodesic computation. User can manually override the area value if needed.</w:t>
             </w:r>
           </w:p>
         </w:tc>
@@ -10266,23 +10122,7 @@
           </w:tcPr>
           <w:p>
             <w:r>
-              <w:t xml:space="preserve">Captured via </w:t>
-            </w:r>
-            <w:proofErr w:type="spellStart"/>
-            <w:r>
-              <w:t>Mapbox</w:t>
-            </w:r>
-            <w:proofErr w:type="spellEnd"/>
-            <w:r>
-              <w:t xml:space="preserve"> Draw plugin. Coordinates are stored in </w:t>
-            </w:r>
-            <w:proofErr w:type="spellStart"/>
-            <w:r>
-              <w:t>PostGIS</w:t>
-            </w:r>
-            <w:proofErr w:type="spellEnd"/>
-            <w:r>
-              <w:t xml:space="preserve"> and used to auto-fetch location-based environmental data.</w:t>
+              <w:t>Captured via Leaflet-Draw plugin. Coordinates are stored in PostGIS and used to auto-fetch location-based environmental data.</w:t>
             </w:r>
           </w:p>
         </w:tc>
@@ -15528,25 +15368,8 @@
             <w:hideMark/>
           </w:tcPr>
           <w:p>
-            <w:proofErr w:type="spellStart"/>
-            <w:r>
-              <w:t>Mapbox</w:t>
-            </w:r>
-            <w:proofErr w:type="spellEnd"/>
-            <w:r>
-              <w:t xml:space="preserve"> GL JS / Google Maps integration, polygon drawing tool (</w:t>
-            </w:r>
-            <w:proofErr w:type="spellStart"/>
-            <w:r>
-              <w:t>Mapbox</w:t>
-            </w:r>
-            <w:proofErr w:type="spellEnd"/>
-            <w:r>
-              <w:t xml:space="preserve"> Draw), pin drop with radius </w:t>
-            </w:r>
-            <w:r>
-              <w:lastRenderedPageBreak/>
-              <w:t>adjustment, area auto-calculation (Turf.js), structured form inputs (land status dropdown, water access radio, capital slider, horizon dropdown), auto-fetched data display (soil, climate with confidence scores), optional override dropdowns for soil type, pH, rainfall, temperature</w:t>
+            <w:r>
+              <w:t>Leaflet / MapLibre GL JS / Google Maps integration, polygon drawing tool (Leaflet-Draw), pin drop with radius adjustment, area auto-calculation (Turf.js), structured form inputs (land status dropdown, water access radio, capital slider, horizon dropdown), auto-fetched data display (soil, climate with confidence scores), optional override dropdowns for soil type, pH, rainfall, temperature</w:t>
             </w:r>
           </w:p>
         </w:tc>
@@ -16609,30 +16432,8 @@
             <w:hideMark/>
           </w:tcPr>
           <w:p>
-            <w:proofErr w:type="spellStart"/>
-            <w:r>
-              <w:lastRenderedPageBreak/>
-              <w:t>SoilGrids</w:t>
-            </w:r>
-            <w:proofErr w:type="spellEnd"/>
-            <w:r>
-              <w:t xml:space="preserve"> API, </w:t>
-            </w:r>
-            <w:proofErr w:type="spellStart"/>
-            <w:r>
-              <w:t>OpenWeatherMap</w:t>
-            </w:r>
-            <w:proofErr w:type="spellEnd"/>
-            <w:r>
-              <w:t xml:space="preserve"> API, NASA POWER API, </w:t>
-            </w:r>
-            <w:proofErr w:type="spellStart"/>
-            <w:r>
-              <w:t>Mapbox</w:t>
-            </w:r>
-            <w:proofErr w:type="spellEnd"/>
-            <w:r>
-              <w:t xml:space="preserve"> Geocoding API, Redis (Caching)</w:t>
+            <w:r>
+              <w:t>SoilGrids API, OpenWeatherMap API, NASA POWER API, OpenStreetMap Geocoding API, Redis (Caching)</w:t>
             </w:r>
           </w:p>
         </w:tc>
@@ -17245,29 +17046,8 @@
             <w:hideMark/>
           </w:tcPr>
           <w:p>
-            <w:proofErr w:type="spellStart"/>
-            <w:r>
-              <w:t>SoilGrids</w:t>
-            </w:r>
-            <w:proofErr w:type="spellEnd"/>
-            <w:r>
-              <w:t xml:space="preserve">, </w:t>
-            </w:r>
-            <w:proofErr w:type="spellStart"/>
-            <w:r>
-              <w:t>OpenWeatherMap</w:t>
-            </w:r>
-            <w:proofErr w:type="spellEnd"/>
-            <w:r>
-              <w:t xml:space="preserve">, NASA POWER, </w:t>
-            </w:r>
-            <w:proofErr w:type="spellStart"/>
-            <w:r>
-              <w:t>Mapbox</w:t>
-            </w:r>
-            <w:proofErr w:type="spellEnd"/>
-            <w:r>
-              <w:t>, Carbon Price API</w:t>
+            <w:r>
+              <w:t>SoilGrids, OpenWeatherMap, NASA POWER, Leaflet/MapLibre, Carbon Price API</w:t>
             </w:r>
           </w:p>
         </w:tc>
@@ -17909,15 +17689,7 @@
     </w:p>
     <w:p>
       <w:r>
-        <w:t>│  │ 3. Reverse Geocode Location Name (</w:t>
-      </w:r>
-      <w:proofErr w:type="spellStart"/>
-      <w:r>
-        <w:t>Mapbox</w:t>
-      </w:r>
-      <w:proofErr w:type="spellEnd"/>
-      <w:r>
-        <w:t xml:space="preserve"> Geocoding)              │   │</w:t>
+        <w:t>│  │ 3. Reverse Geocode Location Name (OpenStreetMap Geocoding)              │   │</w:t>
       </w:r>
     </w:p>
     <w:p>
@@ -18995,13 +18767,8 @@
             <w:hideMark/>
           </w:tcPr>
           <w:p>
-            <w:proofErr w:type="spellStart"/>
-            <w:r>
-              <w:t>Mapbox</w:t>
-            </w:r>
-            <w:proofErr w:type="spellEnd"/>
-            <w:r>
-              <w:t xml:space="preserve"> / Google Maps</w:t>
+            <w:r>
+              <w:t>Leaflet/MapLibre / Google Maps</w:t>
             </w:r>
           </w:p>
         </w:tc>
@@ -19916,21 +19683,7 @@
           </w:tcPr>
           <w:p>
             <w:r>
-              <w:rPr>
-                <w:rFonts w:ascii="Segoe UI Emoji" w:hAnsi="Segoe UI Emoji" w:cs="Segoe UI Emoji"/>
-              </w:rPr>
-              <w:t>✅</w:t>
-            </w:r>
-            <w:r>
-              <w:t xml:space="preserve"> (</w:t>
-            </w:r>
-            <w:proofErr w:type="spellStart"/>
-            <w:r>
-              <w:t>Mapbox</w:t>
-            </w:r>
-            <w:proofErr w:type="spellEnd"/>
-            <w:r>
-              <w:t xml:space="preserve"> Draw validation)</w:t>
+              <w:t>✅ (Leaflet-Draw validation)</w:t>
             </w:r>
           </w:p>
         </w:tc>
@@ -20797,13 +20550,8 @@
             <w:hideMark/>
           </w:tcPr>
           <w:p>
-            <w:proofErr w:type="spellStart"/>
-            <w:r>
-              <w:t>Mapbox</w:t>
-            </w:r>
-            <w:proofErr w:type="spellEnd"/>
-            <w:r>
-              <w:t xml:space="preserve"> GL JS overlay on satellite imagery</w:t>
+            <w:r>
+              <w:t>Leaflet / MapLibre GL JS overlay on satellite imagery</w:t>
             </w:r>
           </w:p>
         </w:tc>
@@ -22921,13 +22669,8 @@
             <w:hideMark/>
           </w:tcPr>
           <w:p>
-            <w:proofErr w:type="spellStart"/>
-            <w:r>
-              <w:t>Mapbox</w:t>
-            </w:r>
-            <w:proofErr w:type="spellEnd"/>
-            <w:r>
-              <w:t xml:space="preserve"> static image API captures the current map view with species zoning overlay.</w:t>
+            <w:r>
+              <w:t>Leaflet/MapLibre static image API captures the current map view with species zoning overlay.</w:t>
             </w:r>
           </w:p>
         </w:tc>
@@ -24115,21 +23858,8 @@
             <w:hideMark/>
           </w:tcPr>
           <w:p>
-            <w:proofErr w:type="spellStart"/>
-            <w:r>
-              <w:rPr>
-                <w:b/>
-                <w:bCs/>
-              </w:rPr>
-              <w:t>Mapbox</w:t>
-            </w:r>
-            <w:proofErr w:type="spellEnd"/>
-            <w:r>
-              <w:rPr>
-                <w:b/>
-                <w:bCs/>
-              </w:rPr>
-              <w:t xml:space="preserve"> GL JS v3.0</w:t>
+            <w:r>
+              <w:t>MapLibre GL JS</w:t>
             </w:r>
           </w:p>
         </w:tc>
@@ -24162,13 +23892,8 @@
             <w:hideMark/>
           </w:tcPr>
           <w:p>
-            <w:proofErr w:type="spellStart"/>
-            <w:r>
-              <w:t>Mapbox</w:t>
-            </w:r>
-            <w:proofErr w:type="spellEnd"/>
-            <w:r>
-              <w:t xml:space="preserve"> Draw plugin (polygon/pin tools), custom map controls, static image API for PDF exports.</w:t>
+            <w:r>
+              <w:t>Leaflet-Draw plugin (polygon/pin tools), custom map controls, static image API for PDF exports.</w:t>
             </w:r>
           </w:p>
         </w:tc>
@@ -25383,21 +25108,8 @@
             <w:hideMark/>
           </w:tcPr>
           <w:p>
-            <w:proofErr w:type="spellStart"/>
-            <w:r>
-              <w:rPr>
-                <w:b/>
-                <w:bCs/>
-              </w:rPr>
-              <w:t>Mapbox</w:t>
-            </w:r>
-            <w:proofErr w:type="spellEnd"/>
-            <w:r>
-              <w:rPr>
-                <w:b/>
-                <w:bCs/>
-              </w:rPr>
-              <w:t xml:space="preserve"> GL JS v3.0</w:t>
+            <w:r>
+              <w:t>MapLibre GL JS</w:t>
             </w:r>
           </w:p>
         </w:tc>
@@ -25665,21 +25377,8 @@
             <w:hideMark/>
           </w:tcPr>
           <w:p>
-            <w:proofErr w:type="spellStart"/>
-            <w:r>
-              <w:rPr>
-                <w:b/>
-                <w:bCs/>
-              </w:rPr>
-              <w:t>Mapbox</w:t>
-            </w:r>
-            <w:proofErr w:type="spellEnd"/>
-            <w:r>
-              <w:rPr>
-                <w:b/>
-                <w:bCs/>
-              </w:rPr>
-              <w:t xml:space="preserve"> Static Images API</w:t>
+            <w:r>
+              <w:t>Leaflet/MapLibre Static Images API</w:t>
             </w:r>
           </w:p>
         </w:tc>
@@ -25735,21 +25434,8 @@
             <w:hideMark/>
           </w:tcPr>
           <w:p>
-            <w:proofErr w:type="spellStart"/>
-            <w:r>
-              <w:rPr>
-                <w:b/>
-                <w:bCs/>
-              </w:rPr>
-              <w:t>Mapbox</w:t>
-            </w:r>
-            <w:proofErr w:type="spellEnd"/>
-            <w:r>
-              <w:rPr>
-                <w:b/>
-                <w:bCs/>
-              </w:rPr>
-              <w:t xml:space="preserve"> Geocoding API</w:t>
+            <w:r>
+              <w:t>OpenStreetMap Geocoding API</w:t>
             </w:r>
           </w:p>
         </w:tc>
@@ -25790,27 +25476,7 @@
           </w:tcPr>
           <w:p>
             <w:r>
-              <w:rPr>
-                <w:b/>
-                <w:bCs/>
-              </w:rPr>
-              <w:t xml:space="preserve">Fallback Mapping (If </w:t>
-            </w:r>
-            <w:proofErr w:type="spellStart"/>
-            <w:r>
-              <w:rPr>
-                <w:b/>
-                <w:bCs/>
-              </w:rPr>
-              <w:t>Mapbox</w:t>
-            </w:r>
-            <w:proofErr w:type="spellEnd"/>
-            <w:r>
-              <w:rPr>
-                <w:b/>
-                <w:bCs/>
-              </w:rPr>
-              <w:t xml:space="preserve"> unavailable)</w:t>
+              <w:t>Fallback Mapping (If Leaflet/MapLibre unavailable)</w:t>
             </w:r>
           </w:p>
         </w:tc>
@@ -26328,21 +25994,8 @@
             <w:hideMark/>
           </w:tcPr>
           <w:p>
-            <w:proofErr w:type="spellStart"/>
-            <w:r>
-              <w:rPr>
-                <w:b/>
-                <w:bCs/>
-              </w:rPr>
-              <w:t>Mapbox</w:t>
-            </w:r>
-            <w:proofErr w:type="spellEnd"/>
-            <w:r>
-              <w:rPr>
-                <w:b/>
-                <w:bCs/>
-              </w:rPr>
-              <w:t xml:space="preserve"> Geocoding</w:t>
+            <w:r>
+              <w:t>OpenStreetMap Geocoding</w:t>
             </w:r>
           </w:p>
         </w:tc>
@@ -26366,15 +26019,7 @@
           </w:tcPr>
           <w:p>
             <w:r>
-              <w:t>API Key (</w:t>
-            </w:r>
-            <w:proofErr w:type="spellStart"/>
-            <w:r>
-              <w:t>Mapbox</w:t>
-            </w:r>
-            <w:proofErr w:type="spellEnd"/>
-            <w:r>
-              <w:t xml:space="preserve"> token)</w:t>
+              <w:t>API Key (Geocoding token)</w:t>
             </w:r>
           </w:p>
         </w:tc>

</xml_diff>